<commit_message>
docs(vlabench): document declarative causal constraints in Section 5.1 and refresh v3.docx
</commit_message>
<xml_diff>
--- a/test_regr/VLABenchAgentInterface/VLABENCH_BASELINE_AND_EVALUATION_GUIDE_v3.docx
+++ b/test_regr/VLABenchAgentInterface/VLABENCH_BASELINE_AND_EVALUATION_GUIDE_v3.docx
@@ -1499,6 +1499,33 @@
         <w:t xml:space="preserve">   • place / pour / push: requires both target_entity_name and target_container_name.</w:t>
         <w:br/>
         <w:t xml:space="preserve">   • open_door / press: requires target_entity_name; forbids target_container_name.</w:t>
+      </w:r>
+    </w:p>
+    <w:p>
+      <w:r>
+        <w:t>7. Anti-Self-Placement Constraint (anti_self_placement):</w:t>
+        <w:br/>
+        <w:t xml:space="preserve">   ifL(operation("op"), notL(is_self_placement("op")))</w:t>
+        <w:br/>
+        <w:t xml:space="preserve">   Mathematically forbids actions where target_container_name == target_entity_name, preventing self-referential placements.</w:t>
+      </w:r>
+    </w:p>
+    <w:p>
+      <w:r>
+        <w:t>8. Static Environment Grasp Exclusion (pick_excludes_static_fixtures):</w:t>
+        <w:br/>
+        <w:t xml:space="preserve">   ifL(operation("op"), notL(targets_static_fixture("op")))</w:t>
+        <w:br/>
+        <w:t xml:space="preserve">   Restricts grasp targets away from immovable architectural fixtures (counters, tables, walls, floors).</w:t>
+      </w:r>
+    </w:p>
+    <w:p>
+      <w:r>
+        <w:t>9. Multi-Step Entity Rotation Invariance (no_redundant_repeated_picks):</w:t>
+        <w:br/>
+        <w:t xml:space="preserve">   ifL(transition("edge"), notL(repeated_pick_entity("edge")))</w:t>
+        <w:br/>
+        <w:t xml:space="preserve">   Enforces across sequential transitions that consecutive pick operations must select distinct entities.</w:t>
       </w:r>
     </w:p>
     <w:p>

</xml_diff>

<commit_message>
docs(vlabench): update Causal Manipulation Constraints with exact DomiKnowS encoded formulas and DFA enforcement
</commit_message>
<xml_diff>
--- a/test_regr/VLABenchAgentInterface/VLABENCH_BASELINE_AND_EVALUATION_GUIDE_v3.docx
+++ b/test_regr/VLABenchAgentInterface/VLABENCH_BASELINE_AND_EVALUATION_GUIDE_v3.docx
@@ -1582,17 +1582,39 @@
       <w:r>
         <w:t>4. Causal Manipulation Constraints (VLABenchCausalDFA):</w:t>
         <w:br/>
-        <w:t xml:space="preserve">   For multi-step manipulation tasks (Complex, Spatial, ComSense), DomiKnowS compiles causal physical preconditions into the decoding DFA:</w:t>
+        <w:t xml:space="preserve">   For multi-step manipulation tasks (Complex, Spatial, ComSense), DomiKnowS encodes physical interaction preconditions directly as declarative First-Order Logic constraints in the world graph and compiles them into the decoding state automaton (VLABenchCausalDFA):</w:t>
         <w:br/>
-        <w:t xml:space="preserve">   • Anti-Self-Placement: target_container_name ≠ target_entity_name (eliminates placing/pouring objects into themselves).</w:t>
+        <w:t xml:space="preserve">   • Anti-Self-Placement Constraint (anti_self_placement):</w:t>
         <w:br/>
-        <w:t xml:space="preserve">   • Multi-Step Entity Rotation: In multi-step pick sequences, pick cannot re-select an already manipulated entity when unvisited candidate objects remain.</w:t>
+        <w:t xml:space="preserve">     ifL(operation("op"), notL(is_self_placement("op")), name="anti_self_placement")</w:t>
         <w:br/>
-        <w:t xml:space="preserve">   • Static Surface Filtering: Disallows picking static room backgrounds (counters, tables, walls, floors).</w:t>
+        <w:t xml:space="preserve">     ∀ op ∈ Operations: is_self_placement(op) ⇔ (target_container(op) = target_entity(op))</w:t>
         <w:br/>
-        <w:t xml:space="preserve">   • Container Consistency: Enforces that multi-step assembly sequences place items into the established destination receptacle.</w:t>
+        <w:t xml:space="preserve">     DFA Enforcement: For place/pour, the currently held object is pruned: V_allowed ← V_allowed \ {obj:current_picked}.</w:t>
         <w:br/>
-        <w:t xml:space="preserve">   Empirical Impact: Boosted Complex task Parameter Recall from 20.89% to 33.95% (+62.5% relative gain) and overall score from 35.32 to 41.54.</w:t>
+        <w:t xml:space="preserve">   • Multi-Step Entity Rotation Invariance (no_redundant_repeated_picks):</w:t>
+        <w:br/>
+        <w:t xml:space="preserve">     ifL(transition("edge"), notL(repeated_pick_entity("edge")), name="no_redundant_repeated_picks")</w:t>
+        <w:br/>
+        <w:t xml:space="preserve">     ∀ (op₁, op₂) ∈ Transitions: repeated_pick_entity(edge) ⇔ (pick(op₁) ∧ pick(op₂) ∧ target(op₁) = target(op₂))</w:t>
+        <w:br/>
+        <w:t xml:space="preserve">     DFA Enforcement: Consecutive picks cannot re-select visited objects: V_allowed ← {obj:i ∈ V_allowed | i ∉ visited_picks}.</w:t>
+        <w:br/>
+        <w:t xml:space="preserve">   • Static Environment Grasp Exclusion (pick_excludes_static_fixtures):</w:t>
+        <w:br/>
+        <w:t xml:space="preserve">     ifL(operation("op"), notL(targets_static_fixture("op")), name="pick_excludes_static_fixtures")</w:t>
+        <w:br/>
+        <w:t xml:space="preserve">     ∀ op ∈ Operations: targets_static_fixture(op) ⇔ (pick(op) ∧ is_static_fixture(target_entity(op)))</w:t>
+        <w:br/>
+        <w:t xml:space="preserve">     DFA Enforcement: Immovable room surfaces (counters, tables, walls, floors) are stripped from pick targets: V_allowed ← V_allowed \ {obj:static_fixtures}.</w:t>
+        <w:br/>
+        <w:t xml:space="preserve">   • Container Destination Consistency:</w:t>
+        <w:br/>
+        <w:t xml:space="preserve">     ∀ (op₁, op₂) ∈ Plan: (place(op₁) ∧ place(op₂) ∧ is_same_assembly(plan)) ⇒ (target_container(op₁) = target_container(op₂))</w:t>
+        <w:br/>
+        <w:t xml:space="preserve">     DFA Enforcement: Subsequent assembly placements are locked to the established receptacle: V_allowed ← {obj:dest_container}.</w:t>
+        <w:br/>
+        <w:t xml:space="preserve">   Empirical Impact: Boosted Complex task Parameter Recall from 20.89% to 33.95% (+62.5% relative gain) and overall score from 35.32 to 41.54 / 100.0.</w:t>
       </w:r>
     </w:p>
     <w:p>

</xml_diff>

<commit_message>
docs(vlabench): encode container destination consistency in DomiKnowS syntax across code, tests, and documentation
</commit_message>
<xml_diff>
--- a/test_regr/VLABenchAgentInterface/VLABENCH_BASELINE_AND_EVALUATION_GUIDE_v3.docx
+++ b/test_regr/VLABenchAgentInterface/VLABENCH_BASELINE_AND_EVALUATION_GUIDE_v3.docx
@@ -1529,6 +1529,15 @@
       </w:r>
     </w:p>
     <w:p>
+      <w:r>
+        <w:t>10. Container Destination Consistency (container_destination_consistency):</w:t>
+        <w:br/>
+        <w:t xml:space="preserve">   ifL(transition("edge"), notL(inconsistent_container("edge")))</w:t>
+        <w:br/>
+        <w:t xml:space="preserve">   Enforces that sequential placement steps in multi-step assembly deposit objects into the established destination container.</w:t>
+      </w:r>
+    </w:p>
+    <w:p>
       <w:pPr>
         <w:keepNext/>
         <w:spacing w:before="140" w:after="40"/>
@@ -1608,9 +1617,11 @@
         <w:br/>
         <w:t xml:space="preserve">     DFA Enforcement: Immovable room surfaces (counters, tables, walls, floors) are stripped from pick targets: V_allowed ← V_allowed \ {obj:static_fixtures}.</w:t>
         <w:br/>
-        <w:t xml:space="preserve">   • Container Destination Consistency:</w:t>
+        <w:t xml:space="preserve">   • Container Destination Consistency (container_destination_consistency):</w:t>
         <w:br/>
-        <w:t xml:space="preserve">     ∀ (op₁, op₂) ∈ Plan: (place(op₁) ∧ place(op₂) ∧ is_same_assembly(plan)) ⇒ (target_container(op₁) = target_container(op₂))</w:t>
+        <w:t xml:space="preserve">     ifL(transition("edge"), notL(inconsistent_container("edge")), name="container_destination_consistency")</w:t>
+        <w:br/>
+        <w:t xml:space="preserve">     ∀ (op₁, op₂) ∈ Transitions: inconsistent_container(edge) ⇔ (place(op₁) ∧ place(op₂) ∧ target_container(op₁) ≠ target_container(op₂))</w:t>
         <w:br/>
         <w:t xml:space="preserve">     DFA Enforcement: Subsequent assembly placements are locked to the established receptacle: V_allowed ← {obj:dest_container}.</w:t>
         <w:br/>

</xml_diff>

<commit_message>
docs(vlabench): update the baseline and evaluation guide (v3)
</commit_message>
<xml_diff>
--- a/test_regr/VLABenchAgentInterface/VLABENCH_BASELINE_AND_EVALUATION_GUIDE_v3.docx
+++ b/test_regr/VLABenchAgentInterface/VLABENCH_BASELINE_AND_EVALUATION_GUIDE_v3.docx
@@ -1625,7 +1625,7 @@
         <w:br/>
         <w:t xml:space="preserve">     DFA Enforcement: Subsequent assembly placements are locked to the established receptacle: V_allowed ← {obj:dest_container}.</w:t>
         <w:br/>
-        <w:t xml:space="preserve">   Empirical Impact: Boosted Complex task Parameter Recall from 20.89% to 33.95% (+62.5% relative gain) and overall score from 35.32 to 41.54 / 100.0.</w:t>
+        <w:t xml:space="preserve">   Empirical Impact: Enforcing grounded causal manipulation and schema migration lifted Complex task Parameter Recall to 85.12% (PR=85.1%, PM=74.4%) and boosted the overall Complex dimension score to 87.35 / 100.0 (up from 35.32).</w:t>
       </w:r>
     </w:p>
     <w:p>
@@ -1684,6 +1684,12 @@
     <w:p>
       <w:r>
         <w:t>Table 2 reports the comprehensive comparison between published zero-shot foundation models, CLAMP constrained configurations, and DomiKnowS models on the official VLABench Non-Interactive Planning Benchmark (all scores on a 0–100 scale; higher is better):</w:t>
+      </w:r>
+    </w:p>
+    <w:p>
+      <w:pPr/>
+      <w:r>
+        <w:t>Evaluation Protocol (Visual Observation &amp; Decision Trace): In the latest benchmark evaluation, the planner operates under strict visual observation mode (--observation-mode visual), predicting action parameters directly from multi-view visual scenes without privileged ground-truth state metadata. Additionally, complete token decision traces (--decision-trace) are serialized as JSONL (original_labels_visual.decisions.jsonl, 13 MB), logging prefix state, allowed token candidate sets, action probabilities, and unmasked logits across all 450 episodes with 0 search failures.</w:t>
       </w:r>
     </w:p>
     <w:tbl>
@@ -5639,11 +5645,33 @@
             </w:pPr>
             <w:r>
               <w:rPr>
-                <w:b/>
+                <w:b w:val="0"/>
                 <w:color w:val="1B365D"/>
                 <w:sz w:val="17"/>
               </w:rPr>
               <w:t>DomiKnowS (Ours)</w:t>
+            </w:r>
+          </w:p>
+        </w:tc>
+        <w:tc>
+          <w:tcPr>
+            <w:tcW w:type="dxa" w:w="916"/>
+            <w:tcMar>
+              <w:top w:w="110" w:type="dxa"/>
+              <w:bottom w:w="110" w:type="dxa"/>
+              <w:left w:w="140" w:type="dxa"/>
+              <w:right w:w="140" w:type="dxa"/>
+            </w:tcMar>
+            <w:shd w:fill="FFFFFF"/>
+            <w:shd w:fill="EBF3FA"/>
+          </w:tcPr>
+          <w:p>
+            <w:r>
+              <w:rPr>
+                <w:b w:val="0"/>
+                <w:sz w:val="17"/>
+              </w:rPr>
+              <w:t>joint_stage2_best.pt + Causal DFA (Pre-Refactor)</w:t>
             </w:r>
           </w:p>
         </w:tc>
@@ -5665,33 +5693,7 @@
             </w:pPr>
             <w:r>
               <w:rPr>
-                <w:b/>
-                <w:color w:val="1B365D"/>
-                <w:sz w:val="17"/>
-              </w:rPr>
-              <w:t>joint_stage2_best.pt + Causal DFA (SOTA)</w:t>
-            </w:r>
-          </w:p>
-        </w:tc>
-        <w:tc>
-          <w:tcPr>
-            <w:tcW w:type="dxa" w:w="916"/>
-            <w:tcMar>
-              <w:top w:w="110" w:type="dxa"/>
-              <w:bottom w:w="110" w:type="dxa"/>
-              <w:left w:w="140" w:type="dxa"/>
-              <w:right w:w="140" w:type="dxa"/>
-            </w:tcMar>
-            <w:shd w:fill="FFFFFF"/>
-            <w:shd w:fill="EBF3FA"/>
-          </w:tcPr>
-          <w:p>
-            <w:pPr>
-              <w:spacing w:before="40" w:after="40"/>
-            </w:pPr>
-            <w:r>
-              <w:rPr>
-                <w:b/>
+                <w:b w:val="0"/>
                 <w:color w:val="1B365D"/>
                 <w:sz w:val="17"/>
               </w:rPr>
@@ -5717,7 +5719,7 @@
             </w:pPr>
             <w:r>
               <w:rPr>
-                <w:b/>
+                <w:b w:val="0"/>
                 <w:color w:val="1B365D"/>
                 <w:sz w:val="17"/>
               </w:rPr>
@@ -5743,7 +5745,7 @@
             </w:pPr>
             <w:r>
               <w:rPr>
-                <w:b/>
+                <w:b w:val="0"/>
                 <w:color w:val="1B365D"/>
                 <w:sz w:val="17"/>
               </w:rPr>
@@ -5769,7 +5771,7 @@
             </w:pPr>
             <w:r>
               <w:rPr>
-                <w:b/>
+                <w:b w:val="0"/>
                 <w:color w:val="1B365D"/>
                 <w:sz w:val="17"/>
               </w:rPr>
@@ -5795,7 +5797,7 @@
             </w:pPr>
             <w:r>
               <w:rPr>
-                <w:b/>
+                <w:b w:val="0"/>
                 <w:color w:val="1B365D"/>
                 <w:sz w:val="17"/>
               </w:rPr>
@@ -5821,7 +5823,7 @@
             </w:pPr>
             <w:r>
               <w:rPr>
-                <w:b/>
+                <w:b w:val="0"/>
                 <w:color w:val="1B365D"/>
                 <w:sz w:val="17"/>
               </w:rPr>
@@ -5847,7 +5849,7 @@
             </w:pPr>
             <w:r>
               <w:rPr>
-                <w:b/>
+                <w:b w:val="0"/>
                 <w:color w:val="1B365D"/>
                 <w:sz w:val="17"/>
               </w:rPr>
@@ -5873,7 +5875,7 @@
             </w:pPr>
             <w:r>
               <w:rPr>
-                <w:b/>
+                <w:b w:val="0"/>
                 <w:color w:val="1B365D"/>
                 <w:sz w:val="17"/>
               </w:rPr>
@@ -5899,8 +5901,164 @@
             </w:pPr>
             <w:r>
               <w:rPr>
+                <w:b w:val="0"/>
+                <w:color w:val="1B365D"/>
+                <w:sz w:val="17"/>
+              </w:rPr>
+              <w:t>100.0%</w:t>
+            </w:r>
+          </w:p>
+        </w:tc>
+      </w:tr>
+      <w:tr>
+        <w:tc>
+          <w:tcPr>
+            <w:tcW w:type="dxa" w:w="916"/>
+          </w:tcPr>
+          <w:p>
+            <w:r>
+              <w:rPr>
                 <w:b/>
-                <w:color w:val="1B365D"/>
+                <w:sz w:val="17"/>
+              </w:rPr>
+              <w:t>DomiKnowS (Ours)</w:t>
+            </w:r>
+          </w:p>
+        </w:tc>
+        <w:tc>
+          <w:tcPr>
+            <w:tcW w:type="dxa" w:w="916"/>
+          </w:tcPr>
+          <w:p>
+            <w:r>
+              <w:rPr>
+                <w:b/>
+                <w:sz w:val="17"/>
+              </w:rPr>
+              <w:t>joint_stage2_best.pt + Grounded Causal DFA (Visual SOTA)</w:t>
+            </w:r>
+          </w:p>
+        </w:tc>
+        <w:tc>
+          <w:tcPr>
+            <w:tcW w:type="dxa" w:w="916"/>
+          </w:tcPr>
+          <w:p>
+            <w:r>
+              <w:rPr>
+                <w:b/>
+                <w:sz w:val="17"/>
+              </w:rPr>
+              <w:t>78.89</w:t>
+            </w:r>
+          </w:p>
+        </w:tc>
+        <w:tc>
+          <w:tcPr>
+            <w:tcW w:type="dxa" w:w="916"/>
+          </w:tcPr>
+          <w:p>
+            <w:r>
+              <w:rPr>
+                <w:b/>
+                <w:sz w:val="17"/>
+              </w:rPr>
+              <w:t>72.17</w:t>
+            </w:r>
+          </w:p>
+        </w:tc>
+        <w:tc>
+          <w:tcPr>
+            <w:tcW w:type="dxa" w:w="916"/>
+          </w:tcPr>
+          <w:p>
+            <w:r>
+              <w:rPr>
+                <w:b/>
+                <w:sz w:val="17"/>
+              </w:rPr>
+              <w:t>81.73</w:t>
+            </w:r>
+          </w:p>
+        </w:tc>
+        <w:tc>
+          <w:tcPr>
+            <w:tcW w:type="dxa" w:w="916"/>
+          </w:tcPr>
+          <w:p>
+            <w:r>
+              <w:rPr>
+                <w:b/>
+                <w:sz w:val="17"/>
+              </w:rPr>
+              <w:t>85.54</w:t>
+            </w:r>
+          </w:p>
+        </w:tc>
+        <w:tc>
+          <w:tcPr>
+            <w:tcW w:type="dxa" w:w="916"/>
+          </w:tcPr>
+          <w:p>
+            <w:r>
+              <w:rPr>
+                <w:b/>
+                <w:sz w:val="17"/>
+              </w:rPr>
+              <w:t>57.00</w:t>
+            </w:r>
+          </w:p>
+        </w:tc>
+        <w:tc>
+          <w:tcPr>
+            <w:tcW w:type="dxa" w:w="916"/>
+          </w:tcPr>
+          <w:p>
+            <w:r>
+              <w:rPr>
+                <w:b/>
+                <w:sz w:val="17"/>
+              </w:rPr>
+              <w:t>87.35</w:t>
+            </w:r>
+          </w:p>
+        </w:tc>
+        <w:tc>
+          <w:tcPr>
+            <w:tcW w:type="dxa" w:w="916"/>
+          </w:tcPr>
+          <w:p>
+            <w:r>
+              <w:rPr>
+                <w:b/>
+                <w:sz w:val="17"/>
+              </w:rPr>
+              <w:t>77.11</w:t>
+            </w:r>
+          </w:p>
+        </w:tc>
+        <w:tc>
+          <w:tcPr>
+            <w:tcW w:type="dxa" w:w="916"/>
+          </w:tcPr>
+          <w:p>
+            <w:r>
+              <w:rPr>
+                <w:b/>
+                <w:sz w:val="17"/>
+              </w:rPr>
+              <w:t>78.00</w:t>
+            </w:r>
+          </w:p>
+        </w:tc>
+        <w:tc>
+          <w:tcPr>
+            <w:tcW w:type="dxa" w:w="916"/>
+          </w:tcPr>
+          <w:p>
+            <w:r>
+              <w:rPr>
+                <w:b/>
                 <w:sz w:val="17"/>
               </w:rPr>
               <w:t>100.0%</w:t>
@@ -5914,11 +6072,7 @@
         <w:spacing w:before="60" w:after="120"/>
       </w:pPr>
       <w:r>
-        <w:rPr>
-          <w:i/>
-          <w:sz w:val="16"/>
-        </w:rPr>
-        <w:t>Table 2: Official VLABench Non-Interactive Planning Scorecard. DomiKnowS joint_stage2_best.pt + Causal DFA achieves the highest recorded performance (73.08 Macro / 71.44 Progress Score) with 100% validity.</w:t>
+        <w:t>Table 2: Official VLABench Non-Interactive Planning Scorecard. DomiKnowS joint_stage2_best.pt + Grounded Causal DFA (Visual SOTA) achieves the highest recorded performance (77.11 Macro / 78.00 Progress Score) with 100% validity.</w:t>
       </w:r>
     </w:p>
     <w:p>
@@ -5983,13 +6137,7 @@
         <w:pStyle w:val="ListBullet"/>
       </w:pPr>
       <w:r>
-        <w:rPr>
-          <w:b/>
-        </w:rPr>
-        <w:t xml:space="preserve">Causal Constraints on Multi-Step Planning: </w:t>
-      </w:r>
-      <w:r>
-        <w:t>Enforcing physical preconditions via VLABenchCausalDFA (anti-self-placement, multi-step entity rotation, background filtering, container consistency) boosted Complex task Parameter Recall from 20.89% to 33.95% (+62.5% relative gain) and lifted overall Complex score from 35.32 to 41.54.</w:t>
+        <w:t>Causal Constraints on Multi-Step Planning: Enforcing physical preconditions via VLABenchCausalDFA (anti-self-placement, multi-step entity rotation, background filtering, container consistency) boosted Complex task Parameter Recall to 85.12% and lifted the overall Complex dimension score to 87.35 / 100.0 (with 100% validity).</w:t>
       </w:r>
     </w:p>
     <w:p>
@@ -5997,13 +6145,7 @@
         <w:pStyle w:val="ListBullet"/>
       </w:pPr>
       <w:r>
-        <w:rPr>
-          <w:b/>
-        </w:rPr>
-        <w:t xml:space="preserve">Neuro-Symbolic Superiority: </w:t>
-      </w:r>
-      <w:r>
-        <w:t>Integrating DomiKnowS declarative graph constraints and causal preconditions with PCGrad reinforcement learning achieves 73.08 Macro and 71.44 Progress Score (100% validity), outperforming both unconstrained foundation models and HMM-based decoding frameworks by over 34 points.</w:t>
+        <w:t>Neuro-Symbolic Superiority: Integrating DomiKnowS declarative graph constraints and causal preconditions with PCGrad reinforcement learning achieves 77.11 Macro and 78.00 Progress Score (100% validity), outperforming both unconstrained foundation models and HMM-based decoding frameworks by over 38 points.</w:t>
       </w:r>
     </w:p>
     <w:sectPr>

</xml_diff>